<commit_message>
[documents] 初三: add 2012届 一模/二模 source.doc archives for question-bank step1 (11 sources, 9 re-extracted word-source.yaml)
</commit_message>
<xml_diff>
--- a/documents/初三/2012届-上海市杨浦区-初三二模数学-试卷及参考答案/word/normalized.docx
+++ b/documents/初三/2012届-上海市杨浦区-初三二模数学-试卷及参考答案/word/normalized.docx
@@ -8,12 +8,7 @@
         <w:spacing w:lineRule="auto" w:line="360"/>
         <w:ind w:hangingChars="130" w:startChars="0" w:start="0" w:endChars="0" w:end="0"/>
         <w:jc w:val="center"/>
-        <w:rPr>
-          <w:rFonts w:ascii="Times New Roman" w:hAnsi="Times New Roman" w:eastAsia="新宋体" w:cs="Times New Roman" w:hint="eastAsia"/>
-          <w:b/>
-          <w:sz w:val="30"/>
-          <w:szCs w:val="30"/>
-        </w:rPr>
+        <w:rPr/>
       </w:pPr>
       <w:r>
         <w:rPr>
@@ -39,12 +34,7 @@
         <w:pStyle w:val="Normal"/>
         <w:spacing w:lineRule="auto" w:line="360"/>
         <w:ind w:hangingChars="130" w:startChars="0" w:start="0" w:endChars="0" w:end="0"/>
-        <w:rPr>
-          <w:rFonts w:ascii="Times New Roman" w:hAnsi="Times New Roman" w:eastAsia="新宋体" w:cs="Times New Roman" w:hint="eastAsia"/>
-          <w:b/>
-          <w:sz w:val="24"/>
-          <w:szCs w:val="24"/>
-        </w:rPr>
+        <w:rPr/>
       </w:pPr>
       <w:r>
         <w:rPr>
@@ -115,11 +105,7 @@
         <w:pStyle w:val="Normal"/>
         <w:spacing w:lineRule="auto" w:line="360"/>
         <w:ind w:hangingChars="130" w:startChars="0" w:start="0" w:endChars="0" w:end="0"/>
-        <w:rPr>
-          <w:rFonts w:ascii="Times New Roman" w:hAnsi="Times New Roman" w:eastAsia="新宋体" w:cs="Times New Roman" w:hint="eastAsia"/>
-          <w:sz w:val="24"/>
-          <w:szCs w:val="24"/>
-        </w:rPr>
+        <w:rPr/>
       </w:pPr>
       <w:r>
         <w:rPr>
@@ -434,11 +420,7 @@
         <w:pStyle w:val="Normal"/>
         <w:spacing w:lineRule="auto" w:line="360"/>
         <w:ind w:hangingChars="130" w:startChars="0" w:start="0" w:endChars="0" w:end="0"/>
-        <w:rPr>
-          <w:rFonts w:ascii="Times New Roman" w:hAnsi="Times New Roman" w:eastAsia="新宋体" w:cs="Times New Roman" w:hint="eastAsia"/>
-          <w:sz w:val="24"/>
-          <w:szCs w:val="24"/>
-        </w:rPr>
+        <w:rPr/>
       </w:pPr>
       <w:r>
         <w:rPr>
@@ -1360,11 +1342,7 @@
         <w:pStyle w:val="Normal"/>
         <w:spacing w:lineRule="auto" w:line="360"/>
         <w:ind w:hangingChars="130" w:startChars="0" w:start="0" w:endChars="0" w:end="0"/>
-        <w:rPr>
-          <w:rFonts w:ascii="Times New Roman" w:hAnsi="Times New Roman" w:eastAsia="新宋体" w:cs="Times New Roman" w:hint="eastAsia"/>
-          <w:sz w:val="24"/>
-          <w:szCs w:val="24"/>
-        </w:rPr>
+        <w:rPr/>
       </w:pPr>
       <w:r>
         <w:rPr>
@@ -1679,11 +1657,7 @@
         <w:pStyle w:val="Normal"/>
         <w:spacing w:lineRule="auto" w:line="360"/>
         <w:ind w:hangingChars="130" w:startChars="0" w:start="0" w:endChars="0" w:end="0"/>
-        <w:rPr>
-          <w:rFonts w:ascii="Times New Roman" w:hAnsi="Times New Roman" w:eastAsia="新宋体" w:cs="Times New Roman" w:hint="eastAsia"/>
-          <w:sz w:val="24"/>
-          <w:szCs w:val="24"/>
-        </w:rPr>
+        <w:rPr/>
       </w:pPr>
       <w:r>
         <w:rPr>
@@ -2200,11 +2174,7 @@
         <w:spacing w:lineRule="auto" w:line="360"/>
         <w:ind w:firstLineChars="130" w:startChars="0" w:start="0" w:endChars="0" w:end="0"/>
         <w:jc w:val="start"/>
-        <w:rPr>
-          <w:rFonts w:ascii="Times New Roman" w:hAnsi="Times New Roman" w:eastAsia="新宋体" w:cs="Times New Roman" w:hint="eastAsia"/>
-          <w:sz w:val="24"/>
-          <w:szCs w:val="24"/>
-        </w:rPr>
+        <w:rPr/>
       </w:pPr>
       <w:r>
         <w:rPr>
@@ -2228,12 +2198,7 @@
         <w:pStyle w:val="Normal"/>
         <w:spacing w:lineRule="auto" w:line="360"/>
         <w:ind w:hangingChars="130" w:startChars="0" w:start="0" w:endChars="0" w:end="0"/>
-        <w:rPr>
-          <w:rFonts w:ascii="Times New Roman" w:hAnsi="Times New Roman" w:eastAsia="新宋体" w:cs="Times New Roman" w:hint="eastAsia"/>
-          <w:b/>
-          <w:sz w:val="24"/>
-          <w:szCs w:val="24"/>
-        </w:rPr>
+        <w:rPr/>
       </w:pPr>
       <w:r>
         <w:rPr>
@@ -3173,11 +3138,7 @@
         <w:pStyle w:val="Normal"/>
         <w:spacing w:lineRule="auto" w:line="360"/>
         <w:ind w:hangingChars="130" w:startChars="0" w:start="0" w:endChars="0" w:end="0"/>
-        <w:rPr>
-          <w:rFonts w:ascii="Times New Roman" w:hAnsi="Times New Roman" w:eastAsia="新宋体" w:cs="Times New Roman" w:hint="eastAsia"/>
-          <w:sz w:val="24"/>
-          <w:szCs w:val="24"/>
-        </w:rPr>
+        <w:rPr/>
       </w:pPr>
       <w:r>
         <w:rPr>
@@ -4024,11 +3985,7 @@
         <w:pStyle w:val="Normal"/>
         <w:spacing w:lineRule="auto" w:line="360"/>
         <w:ind w:hangingChars="130" w:startChars="0" w:start="0" w:endChars="0" w:end="0"/>
-        <w:rPr>
-          <w:rFonts w:ascii="Times New Roman" w:hAnsi="Times New Roman" w:eastAsia="新宋体" w:cs="Times New Roman" w:hint="eastAsia"/>
-          <w:sz w:val="24"/>
-          <w:szCs w:val="24"/>
-        </w:rPr>
+        <w:rPr/>
       </w:pPr>
       <w:r>
         <w:rPr>
@@ -4288,11 +4245,7 @@
         <w:pStyle w:val="Normal"/>
         <w:spacing w:lineRule="auto" w:line="360"/>
         <w:ind w:hangingChars="130" w:startChars="0" w:start="0" w:endChars="0" w:end="0"/>
-        <w:rPr>
-          <w:rFonts w:ascii="Times New Roman" w:hAnsi="Times New Roman" w:eastAsia="新宋体" w:cs="Times New Roman" w:hint="eastAsia"/>
-          <w:sz w:val="24"/>
-          <w:szCs w:val="24"/>
-        </w:rPr>
+        <w:rPr/>
       </w:pPr>
       <w:r>
         <w:rPr>
@@ -4594,11 +4547,7 @@
         <w:pStyle w:val="Normal"/>
         <w:spacing w:lineRule="auto" w:line="360"/>
         <w:ind w:hangingChars="130" w:startChars="0" w:start="0" w:endChars="0" w:end="0"/>
-        <w:rPr>
-          <w:rFonts w:ascii="Times New Roman" w:hAnsi="Times New Roman" w:eastAsia="新宋体" w:cs="Times New Roman" w:hint="eastAsia"/>
-          <w:sz w:val="24"/>
-          <w:szCs w:val="24"/>
-        </w:rPr>
+        <w:rPr/>
       </w:pPr>
       <w:r>
         <w:rPr>
@@ -4652,12 +4601,7 @@
         <w:pStyle w:val="Normal"/>
         <w:spacing w:lineRule="auto" w:line="360"/>
         <w:ind w:hangingChars="130" w:startChars="0" w:start="0" w:endChars="0" w:end="0"/>
-        <w:rPr>
-          <w:rFonts w:ascii="Times New Roman" w:hAnsi="Times New Roman" w:eastAsia="新宋体" w:cs="Times New Roman" w:hint="eastAsia"/>
-          <w:b/>
-          <w:sz w:val="24"/>
-          <w:szCs w:val="24"/>
-        </w:rPr>
+        <w:rPr/>
       </w:pPr>
       <w:r>
         <w:rPr>
@@ -5126,11 +5070,7 @@
         <w:pStyle w:val="Normal"/>
         <w:spacing w:lineRule="auto" w:line="360"/>
         <w:ind w:hangingChars="130" w:startChars="0" w:start="0" w:endChars="0" w:end="0"/>
-        <w:rPr>
-          <w:rFonts w:ascii="Times New Roman" w:hAnsi="Times New Roman" w:eastAsia="新宋体" w:cs="Times New Roman" w:hint="eastAsia"/>
-          <w:sz w:val="24"/>
-          <w:szCs w:val="24"/>
-        </w:rPr>
+        <w:rPr/>
       </w:pPr>
       <w:r>
         <w:rPr>
@@ -5278,11 +5218,7 @@
         <w:pStyle w:val="Normal"/>
         <w:spacing w:lineRule="auto" w:line="360"/>
         <w:ind w:hangingChars="130" w:startChars="0" w:start="0" w:endChars="0" w:end="0"/>
-        <w:rPr>
-          <w:rFonts w:ascii="Times New Roman" w:hAnsi="Times New Roman" w:eastAsia="新宋体" w:cs="Times New Roman" w:hint="eastAsia"/>
-          <w:sz w:val="24"/>
-          <w:szCs w:val="24"/>
-        </w:rPr>
+        <w:rPr/>
       </w:pPr>
       <w:r>
         <w:rPr>
@@ -5505,11 +5441,7 @@
         <w:pStyle w:val="Normal"/>
         <w:spacing w:lineRule="auto" w:line="360"/>
         <w:ind w:hangingChars="130" w:startChars="0" w:start="0" w:endChars="0" w:end="0"/>
-        <w:rPr>
-          <w:rFonts w:ascii="Times New Roman" w:hAnsi="Times New Roman" w:eastAsia="新宋体" w:cs="Times New Roman" w:hint="eastAsia"/>
-          <w:sz w:val="24"/>
-          <w:szCs w:val="24"/>
-        </w:rPr>
+        <w:rPr/>
       </w:pPr>
       <w:r>
         <w:rPr>
@@ -5563,11 +5495,7 @@
         <w:pStyle w:val="Normal"/>
         <w:spacing w:lineRule="auto" w:line="360"/>
         <w:ind w:hangingChars="130" w:startChars="0" w:start="0" w:endChars="0" w:end="0"/>
-        <w:rPr>
-          <w:rFonts w:ascii="Times New Roman" w:hAnsi="Times New Roman" w:eastAsia="新宋体" w:cs="Times New Roman" w:hint="eastAsia"/>
-          <w:sz w:val="24"/>
-          <w:szCs w:val="24"/>
-        </w:rPr>
+        <w:rPr/>
       </w:pPr>
       <w:r>
         <w:rPr>
@@ -5667,11 +5595,7 @@
               <w:spacing w:lineRule="auto" w:line="360"/>
               <w:ind w:hangingChars="130" w:startChars="0" w:start="0" w:endChars="0" w:end="0"/>
               <w:jc w:val="center"/>
-              <w:rPr>
-                <w:rFonts w:ascii="Times New Roman" w:hAnsi="Times New Roman" w:eastAsia="新宋体" w:cs="Times New Roman" w:hint="eastAsia"/>
-                <w:sz w:val="24"/>
-                <w:szCs w:val="24"/>
-              </w:rPr>
+              <w:rPr/>
             </w:pPr>
             <w:r>
               <w:rPr>
@@ -5699,11 +5623,7 @@
               <w:spacing w:lineRule="auto" w:line="360"/>
               <w:ind w:hangingChars="130" w:startChars="0" w:start="0" w:endChars="0" w:end="0"/>
               <w:jc w:val="center"/>
-              <w:rPr>
-                <w:rFonts w:ascii="Times New Roman" w:hAnsi="Times New Roman" w:eastAsia="新宋体" w:cs="Times New Roman" w:hint="eastAsia"/>
-                <w:sz w:val="24"/>
-                <w:szCs w:val="24"/>
-              </w:rPr>
+              <w:rPr/>
             </w:pPr>
             <w:r>
               <w:rPr>
@@ -5731,11 +5651,7 @@
               <w:spacing w:lineRule="auto" w:line="360"/>
               <w:ind w:hangingChars="130" w:startChars="0" w:start="0" w:endChars="0" w:end="0"/>
               <w:jc w:val="center"/>
-              <w:rPr>
-                <w:rFonts w:ascii="Times New Roman" w:hAnsi="Times New Roman" w:eastAsia="新宋体" w:cs="Times New Roman" w:hint="eastAsia"/>
-                <w:sz w:val="24"/>
-                <w:szCs w:val="24"/>
-              </w:rPr>
+              <w:rPr/>
             </w:pPr>
             <w:r>
               <w:rPr>
@@ -5763,11 +5679,7 @@
               <w:spacing w:lineRule="auto" w:line="360"/>
               <w:ind w:hangingChars="130" w:startChars="0" w:start="0" w:endChars="0" w:end="0"/>
               <w:jc w:val="center"/>
-              <w:rPr>
-                <w:rFonts w:ascii="Times New Roman" w:hAnsi="Times New Roman" w:eastAsia="新宋体" w:cs="Times New Roman" w:hint="eastAsia"/>
-                <w:sz w:val="24"/>
-                <w:szCs w:val="24"/>
-              </w:rPr>
+              <w:rPr/>
             </w:pPr>
             <w:r>
               <w:rPr>
@@ -5795,11 +5707,7 @@
               <w:spacing w:lineRule="auto" w:line="360"/>
               <w:ind w:hangingChars="130" w:startChars="0" w:start="0" w:endChars="0" w:end="0"/>
               <w:jc w:val="center"/>
-              <w:rPr>
-                <w:rFonts w:ascii="Times New Roman" w:hAnsi="Times New Roman" w:eastAsia="新宋体" w:cs="Times New Roman" w:hint="eastAsia"/>
-                <w:sz w:val="24"/>
-                <w:szCs w:val="24"/>
-              </w:rPr>
+              <w:rPr/>
             </w:pPr>
             <w:r>
               <w:rPr>
@@ -5827,11 +5735,7 @@
               <w:spacing w:lineRule="auto" w:line="360"/>
               <w:ind w:hangingChars="130" w:startChars="0" w:start="0" w:endChars="0" w:end="0"/>
               <w:jc w:val="center"/>
-              <w:rPr>
-                <w:rFonts w:ascii="Times New Roman" w:hAnsi="Times New Roman" w:eastAsia="新宋体" w:cs="Times New Roman" w:hint="eastAsia"/>
-                <w:sz w:val="24"/>
-                <w:szCs w:val="24"/>
-              </w:rPr>
+              <w:rPr/>
             </w:pPr>
             <w:r>
               <w:rPr>
@@ -5859,11 +5763,7 @@
               <w:spacing w:lineRule="auto" w:line="360"/>
               <w:ind w:hangingChars="130" w:startChars="0" w:start="0" w:endChars="0" w:end="0"/>
               <w:jc w:val="center"/>
-              <w:rPr>
-                <w:rFonts w:ascii="Times New Roman" w:hAnsi="Times New Roman" w:eastAsia="新宋体" w:cs="Times New Roman" w:hint="eastAsia"/>
-                <w:sz w:val="24"/>
-                <w:szCs w:val="24"/>
-              </w:rPr>
+              <w:rPr/>
             </w:pPr>
             <w:r>
               <w:rPr>
@@ -5894,11 +5794,7 @@
               <w:spacing w:lineRule="auto" w:line="360"/>
               <w:ind w:hangingChars="130" w:startChars="0" w:start="0" w:endChars="0" w:end="0"/>
               <w:jc w:val="center"/>
-              <w:rPr>
-                <w:rFonts w:ascii="Times New Roman" w:hAnsi="Times New Roman" w:eastAsia="新宋体" w:cs="Times New Roman" w:hint="eastAsia"/>
-                <w:sz w:val="24"/>
-                <w:szCs w:val="24"/>
-              </w:rPr>
+              <w:rPr/>
             </w:pPr>
             <w:r>
               <w:rPr>
@@ -5926,11 +5822,7 @@
               <w:spacing w:lineRule="auto" w:line="360"/>
               <w:ind w:hangingChars="130" w:startChars="0" w:start="0" w:endChars="0" w:end="0"/>
               <w:jc w:val="center"/>
-              <w:rPr>
-                <w:rFonts w:ascii="Times New Roman" w:hAnsi="Times New Roman" w:eastAsia="新宋体" w:cs="Times New Roman" w:hint="eastAsia"/>
-                <w:sz w:val="24"/>
-                <w:szCs w:val="24"/>
-              </w:rPr>
+              <w:rPr/>
             </w:pPr>
             <w:r>
               <w:rPr>
@@ -5958,11 +5850,7 @@
               <w:spacing w:lineRule="auto" w:line="360"/>
               <w:ind w:hangingChars="130" w:startChars="0" w:start="0" w:endChars="0" w:end="0"/>
               <w:jc w:val="center"/>
-              <w:rPr>
-                <w:rFonts w:ascii="Times New Roman" w:hAnsi="Times New Roman" w:eastAsia="新宋体" w:cs="Times New Roman" w:hint="eastAsia"/>
-                <w:sz w:val="24"/>
-                <w:szCs w:val="24"/>
-              </w:rPr>
+              <w:rPr/>
             </w:pPr>
             <w:r>
               <w:rPr>
@@ -5990,11 +5878,7 @@
               <w:spacing w:lineRule="auto" w:line="360"/>
               <w:ind w:hangingChars="130" w:startChars="0" w:start="0" w:endChars="0" w:end="0"/>
               <w:jc w:val="center"/>
-              <w:rPr>
-                <w:rFonts w:ascii="Times New Roman" w:hAnsi="Times New Roman" w:eastAsia="新宋体" w:cs="Times New Roman" w:hint="eastAsia"/>
-                <w:sz w:val="24"/>
-                <w:szCs w:val="24"/>
-              </w:rPr>
+              <w:rPr/>
             </w:pPr>
             <w:r>
               <w:rPr>
@@ -6022,11 +5906,7 @@
               <w:spacing w:lineRule="auto" w:line="360"/>
               <w:ind w:hangingChars="130" w:startChars="0" w:start="0" w:endChars="0" w:end="0"/>
               <w:jc w:val="center"/>
-              <w:rPr>
-                <w:rFonts w:ascii="Times New Roman" w:hAnsi="Times New Roman" w:eastAsia="新宋体" w:cs="Times New Roman" w:hint="eastAsia"/>
-                <w:sz w:val="24"/>
-                <w:szCs w:val="24"/>
-              </w:rPr>
+              <w:rPr/>
             </w:pPr>
             <w:r>
               <w:rPr>
@@ -6054,11 +5934,7 @@
               <w:spacing w:lineRule="auto" w:line="360"/>
               <w:ind w:hangingChars="130" w:startChars="0" w:start="0" w:endChars="0" w:end="0"/>
               <w:jc w:val="center"/>
-              <w:rPr>
-                <w:rFonts w:ascii="Times New Roman" w:hAnsi="Times New Roman" w:eastAsia="新宋体" w:cs="Times New Roman" w:hint="eastAsia"/>
-                <w:sz w:val="24"/>
-                <w:szCs w:val="24"/>
-              </w:rPr>
+              <w:rPr/>
             </w:pPr>
             <w:r>
               <w:rPr>
@@ -6086,11 +5962,7 @@
               <w:spacing w:lineRule="auto" w:line="360"/>
               <w:ind w:hangingChars="130" w:startChars="0" w:start="0" w:endChars="0" w:end="0"/>
               <w:jc w:val="center"/>
-              <w:rPr>
-                <w:rFonts w:ascii="Times New Roman" w:hAnsi="Times New Roman" w:eastAsia="新宋体" w:cs="Times New Roman" w:hint="eastAsia"/>
-                <w:sz w:val="24"/>
-                <w:szCs w:val="24"/>
-              </w:rPr>
+              <w:rPr/>
             </w:pPr>
             <w:r>
               <w:rPr>
@@ -6118,11 +5990,7 @@
               <w:spacing w:lineRule="auto" w:line="360"/>
               <w:ind w:hangingChars="130" w:startChars="0" w:start="0" w:endChars="0" w:end="0"/>
               <w:jc w:val="center"/>
-              <w:rPr>
-                <w:rFonts w:ascii="Times New Roman" w:hAnsi="Times New Roman" w:eastAsia="新宋体" w:cs="Times New Roman" w:hint="eastAsia"/>
-                <w:sz w:val="24"/>
-                <w:szCs w:val="24"/>
-              </w:rPr>
+              <w:rPr/>
             </w:pPr>
             <w:r>
               <w:rPr>
@@ -6157,11 +6025,7 @@
         <w:pStyle w:val="Normal"/>
         <w:spacing w:lineRule="auto" w:line="360"/>
         <w:ind w:hangingChars="130" w:startChars="0" w:start="0" w:endChars="0" w:end="0"/>
-        <w:rPr>
-          <w:rFonts w:ascii="Times New Roman" w:hAnsi="Times New Roman" w:eastAsia="新宋体" w:cs="Times New Roman" w:hint="eastAsia"/>
-          <w:sz w:val="24"/>
-          <w:szCs w:val="24"/>
-        </w:rPr>
+        <w:rPr/>
       </w:pPr>
       <w:r>
         <w:rPr>
@@ -6456,11 +6320,7 @@
         <w:pStyle w:val="Normal"/>
         <w:spacing w:lineRule="auto" w:line="360"/>
         <w:ind w:hangingChars="130" w:startChars="0" w:start="0" w:endChars="0" w:end="0"/>
-        <w:rPr>
-          <w:rFonts w:ascii="Times New Roman" w:hAnsi="Times New Roman" w:eastAsia="新宋体" w:cs="Times New Roman" w:hint="eastAsia"/>
-          <w:sz w:val="24"/>
-          <w:szCs w:val="24"/>
-        </w:rPr>
+        <w:rPr/>
       </w:pPr>
       <w:r>
         <w:rPr>
@@ -6884,11 +6744,7 @@
         <w:pStyle w:val="Normal"/>
         <w:spacing w:lineRule="auto" w:line="360"/>
         <w:ind w:hangingChars="130" w:startChars="0" w:start="0" w:endChars="0" w:end="0"/>
-        <w:rPr>
-          <w:rFonts w:ascii="Times New Roman" w:hAnsi="Times New Roman" w:eastAsia="新宋体" w:cs="Times New Roman" w:hint="eastAsia"/>
-          <w:sz w:val="24"/>
-          <w:szCs w:val="24"/>
-        </w:rPr>
+        <w:rPr/>
       </w:pPr>
       <w:r>
         <w:rPr>
@@ -7441,11 +7297,7 @@
         <w:pStyle w:val="Normal"/>
         <w:spacing w:lineRule="auto" w:line="360"/>
         <w:ind w:hangingChars="130" w:startChars="0" w:start="0" w:endChars="0" w:end="0"/>
-        <w:rPr>
-          <w:rFonts w:ascii="Times New Roman" w:hAnsi="Times New Roman" w:eastAsia="新宋体" w:cs="Times New Roman" w:hint="eastAsia"/>
-          <w:sz w:val="24"/>
-          <w:szCs w:val="24"/>
-        </w:rPr>
+        <w:rPr/>
       </w:pPr>
       <w:r>
         <w:rPr>
@@ -7886,11 +7738,7 @@
         <w:pStyle w:val="Normal"/>
         <w:spacing w:lineRule="auto" w:line="360"/>
         <w:ind w:hangingChars="130" w:startChars="0" w:start="0" w:endChars="0" w:end="0"/>
-        <w:rPr>
-          <w:rFonts w:ascii="Times New Roman" w:hAnsi="Times New Roman" w:eastAsia="新宋体" w:cs="Times New Roman" w:hint="eastAsia"/>
-          <w:sz w:val="24"/>
-          <w:szCs w:val="24"/>
-        </w:rPr>
+        <w:rPr/>
       </w:pPr>
       <w:r>
         <w:rPr>
@@ -8294,12 +8142,7 @@
         <w:spacing w:lineRule="auto" w:line="360"/>
         <w:ind w:hangingChars="130" w:startChars="0" w:start="0" w:endChars="0" w:end="0"/>
         <w:jc w:val="center"/>
-        <w:rPr>
-          <w:rFonts w:ascii="Times New Roman" w:hAnsi="Times New Roman" w:eastAsia="新宋体" w:cs="Times New Roman" w:hint="eastAsia"/>
-          <w:b/>
-          <w:sz w:val="34"/>
-          <w:szCs w:val="34"/>
-        </w:rPr>
+        <w:rPr/>
       </w:pPr>
       <w:r>
         <w:rPr>
@@ -8326,12 +8169,7 @@
         <w:spacing w:lineRule="auto" w:line="360"/>
         <w:ind w:hangingChars="130" w:startChars="0" w:start="0" w:endChars="0" w:end="0"/>
         <w:jc w:val="center"/>
-        <w:rPr>
-          <w:rFonts w:ascii="Times New Roman" w:hAnsi="Times New Roman" w:eastAsia="新宋体" w:cs="Times New Roman" w:hint="eastAsia"/>
-          <w:b/>
-          <w:sz w:val="16"/>
-          <w:szCs w:val="16"/>
-        </w:rPr>
+        <w:rPr/>
       </w:pPr>
       <w:r>
         <w:rPr>
@@ -8348,12 +8186,7 @@
         <w:pStyle w:val="Normal"/>
         <w:spacing w:lineRule="auto" w:line="360"/>
         <w:ind w:hangingChars="130" w:startChars="0" w:start="0" w:endChars="0" w:end="0"/>
-        <w:rPr>
-          <w:rFonts w:ascii="Times New Roman" w:hAnsi="Times New Roman" w:eastAsia="新宋体" w:cs="Times New Roman" w:hint="eastAsia"/>
-          <w:b/>
-          <w:sz w:val="24"/>
-          <w:szCs w:val="24"/>
-        </w:rPr>
+        <w:rPr/>
       </w:pPr>
       <w:r>
         <w:rPr>
@@ -9285,11 +9118,7 @@
         <w:pStyle w:val="Normal"/>
         <w:spacing w:lineRule="auto" w:line="360"/>
         <w:ind w:hangingChars="130" w:startChars="0" w:start="0" w:endChars="0" w:end="0"/>
-        <w:rPr>
-          <w:rFonts w:ascii="Times New Roman" w:hAnsi="Times New Roman" w:eastAsia="新宋体" w:cs="Times New Roman" w:hint="eastAsia"/>
-          <w:sz w:val="24"/>
-          <w:szCs w:val="24"/>
-        </w:rPr>
+        <w:rPr/>
       </w:pPr>
       <w:r>
         <w:rPr>
@@ -9321,11 +9150,7 @@
         <w:pStyle w:val="Normal"/>
         <w:spacing w:lineRule="auto" w:line="360"/>
         <w:ind w:hangingChars="130" w:startChars="0" w:start="0" w:endChars="0" w:end="0"/>
-        <w:rPr>
-          <w:rFonts w:ascii="Times New Roman" w:hAnsi="Times New Roman" w:eastAsia="新宋体" w:cs="Times New Roman" w:hint="eastAsia"/>
-          <w:sz w:val="24"/>
-          <w:szCs w:val="24"/>
-        </w:rPr>
+        <w:rPr/>
       </w:pPr>
       <w:r>
         <w:rPr>
@@ -9357,11 +9182,7 @@
         <w:pStyle w:val="Normal"/>
         <w:spacing w:lineRule="auto" w:line="360"/>
         <w:ind w:hangingChars="130" w:startChars="0" w:start="0" w:endChars="0" w:end="0"/>
-        <w:rPr>
-          <w:rFonts w:ascii="Times New Roman" w:hAnsi="Times New Roman" w:eastAsia="新宋体" w:cs="Times New Roman" w:hint="eastAsia"/>
-          <w:sz w:val="24"/>
-          <w:szCs w:val="24"/>
-        </w:rPr>
+        <w:rPr/>
       </w:pPr>
       <w:r>
         <w:rPr>
@@ -12198,11 +12019,7 @@
         <w:pStyle w:val="Normal"/>
         <w:spacing w:lineRule="auto" w:line="360"/>
         <w:ind w:hangingChars="130" w:startChars="0" w:start="0" w:endChars="0" w:end="0"/>
-        <w:rPr>
-          <w:rFonts w:ascii="Times New Roman" w:hAnsi="Times New Roman" w:eastAsia="新宋体" w:cs="Times New Roman" w:hint="eastAsia"/>
-          <w:sz w:val="24"/>
-          <w:szCs w:val="24"/>
-        </w:rPr>
+        <w:rPr/>
       </w:pPr>
       <w:r>
         <w:rPr>
@@ -12759,11 +12576,7 @@
         <w:pStyle w:val="Normal"/>
         <w:spacing w:lineRule="auto" w:line="360"/>
         <w:ind w:hangingChars="130" w:startChars="0" w:start="0" w:endChars="0" w:end="0"/>
-        <w:rPr>
-          <w:rFonts w:ascii="Times New Roman" w:hAnsi="Times New Roman" w:eastAsia="新宋体" w:cs="Times New Roman" w:hint="eastAsia"/>
-          <w:sz w:val="24"/>
-          <w:szCs w:val="24"/>
-        </w:rPr>
+        <w:rPr/>
       </w:pPr>
       <w:r>
         <w:rPr>
@@ -13280,11 +13093,7 @@
         <w:spacing w:lineRule="auto" w:line="360"/>
         <w:ind w:firstLineChars="130" w:startChars="0" w:start="0" w:endChars="0" w:end="0"/>
         <w:jc w:val="start"/>
-        <w:rPr>
-          <w:rFonts w:ascii="Times New Roman" w:hAnsi="Times New Roman" w:eastAsia="新宋体" w:cs="Times New Roman" w:hint="eastAsia"/>
-          <w:sz w:val="24"/>
-          <w:szCs w:val="24"/>
-        </w:rPr>
+        <w:rPr/>
       </w:pPr>
       <w:r>
         <w:rPr>
@@ -14029,12 +13838,7 @@
         <w:pStyle w:val="Normal"/>
         <w:spacing w:lineRule="auto" w:line="360"/>
         <w:ind w:hangingChars="130" w:startChars="0" w:start="0" w:endChars="0" w:end="0"/>
-        <w:rPr>
-          <w:rFonts w:ascii="Times New Roman" w:hAnsi="Times New Roman" w:eastAsia="新宋体" w:cs="Times New Roman" w:hint="eastAsia"/>
-          <w:b/>
-          <w:sz w:val="24"/>
-          <w:szCs w:val="24"/>
-        </w:rPr>
+        <w:rPr/>
       </w:pPr>
       <w:r>
         <w:rPr>
@@ -17403,11 +17207,7 @@
         <w:pStyle w:val="Normal"/>
         <w:spacing w:lineRule="auto" w:line="360"/>
         <w:ind w:hangingChars="130" w:startChars="0" w:start="0" w:endChars="0" w:end="0"/>
-        <w:rPr>
-          <w:rFonts w:ascii="Times New Roman" w:hAnsi="Times New Roman" w:eastAsia="新宋体" w:cs="Times New Roman" w:hint="eastAsia"/>
-          <w:sz w:val="24"/>
-          <w:szCs w:val="24"/>
-        </w:rPr>
+        <w:rPr/>
       </w:pPr>
       <w:r>
         <w:rPr>
@@ -17929,11 +17729,7 @@
         <w:pStyle w:val="Normal"/>
         <w:spacing w:lineRule="auto" w:line="360"/>
         <w:ind w:hangingChars="130" w:startChars="0" w:start="0" w:endChars="0" w:end="0"/>
-        <w:rPr>
-          <w:rFonts w:ascii="Times New Roman" w:hAnsi="Times New Roman" w:eastAsia="新宋体" w:cs="Times New Roman" w:hint="eastAsia"/>
-          <w:sz w:val="24"/>
-          <w:szCs w:val="24"/>
-        </w:rPr>
+        <w:rPr/>
       </w:pPr>
       <w:r>
         <w:rPr>
@@ -21292,11 +21088,7 @@
         <w:pStyle w:val="Normal"/>
         <w:spacing w:lineRule="auto" w:line="360"/>
         <w:ind w:hangingChars="130" w:startChars="0" w:start="0" w:endChars="0" w:end="0"/>
-        <w:rPr>
-          <w:rFonts w:ascii="Times New Roman" w:hAnsi="Times New Roman" w:eastAsia="新宋体" w:cs="Times New Roman" w:hint="eastAsia"/>
-          <w:sz w:val="24"/>
-          <w:szCs w:val="24"/>
-        </w:rPr>
+        <w:rPr/>
       </w:pPr>
       <w:r>
         <w:rPr>
@@ -22419,11 +22211,7 @@
         <w:pStyle w:val="Normal"/>
         <w:spacing w:lineRule="auto" w:line="360"/>
         <w:ind w:hangingChars="130" w:startChars="0" w:start="0" w:endChars="0" w:end="0"/>
-        <w:rPr>
-          <w:rFonts w:ascii="Times New Roman" w:hAnsi="Times New Roman" w:eastAsia="新宋体" w:cs="Times New Roman" w:hint="eastAsia"/>
-          <w:sz w:val="24"/>
-          <w:szCs w:val="24"/>
-        </w:rPr>
+        <w:rPr/>
       </w:pPr>
       <w:r>
         <w:rPr>
@@ -23153,11 +22941,7 @@
         <w:pStyle w:val="Normal"/>
         <w:spacing w:lineRule="auto" w:line="360"/>
         <w:ind w:hangingChars="130" w:startChars="0" w:start="0" w:endChars="0" w:end="0"/>
-        <w:rPr>
-          <w:rFonts w:ascii="Times New Roman" w:hAnsi="Times New Roman" w:eastAsia="新宋体" w:cs="Times New Roman" w:hint="eastAsia"/>
-          <w:sz w:val="24"/>
-          <w:szCs w:val="24"/>
-        </w:rPr>
+        <w:rPr/>
       </w:pPr>
       <w:r>
         <w:rPr>
@@ -23181,11 +22965,7 @@
         <w:pStyle w:val="Normal"/>
         <w:spacing w:lineRule="auto" w:line="360"/>
         <w:ind w:hangingChars="130" w:startChars="0" w:start="0" w:endChars="0" w:end="0"/>
-        <w:rPr>
-          <w:rFonts w:ascii="Times New Roman" w:hAnsi="Times New Roman" w:eastAsia="新宋体" w:cs="Times New Roman" w:hint="eastAsia"/>
-          <w:sz w:val="24"/>
-          <w:szCs w:val="24"/>
-        </w:rPr>
+        <w:rPr/>
       </w:pPr>
       <w:r>
         <w:rPr>
@@ -23520,11 +23300,7 @@
         <w:pStyle w:val="Normal"/>
         <w:spacing w:lineRule="auto" w:line="360"/>
         <w:ind w:hangingChars="130" w:startChars="0" w:start="0" w:endChars="0" w:end="0"/>
-        <w:rPr>
-          <w:rFonts w:ascii="Times New Roman" w:hAnsi="Times New Roman" w:eastAsia="新宋体" w:cs="Times New Roman" w:hint="eastAsia"/>
-          <w:sz w:val="24"/>
-          <w:szCs w:val="24"/>
-        </w:rPr>
+        <w:rPr/>
       </w:pPr>
       <w:r>
         <w:rPr>
@@ -24346,11 +24122,7 @@
         <w:pStyle w:val="Normal"/>
         <w:spacing w:lineRule="auto" w:line="360"/>
         <w:ind w:hangingChars="130" w:startChars="0" w:start="0" w:endChars="0" w:end="0"/>
-        <w:rPr>
-          <w:rFonts w:ascii="Times New Roman" w:hAnsi="Times New Roman" w:eastAsia="新宋体" w:cs="Times New Roman" w:hint="eastAsia"/>
-          <w:sz w:val="24"/>
-          <w:szCs w:val="24"/>
-        </w:rPr>
+        <w:rPr/>
       </w:pPr>
       <w:r>
         <w:rPr>
@@ -24711,11 +24483,7 @@
         <w:pStyle w:val="Normal"/>
         <w:spacing w:lineRule="auto" w:line="360"/>
         <w:ind w:hangingChars="130" w:startChars="0" w:start="0" w:endChars="0" w:end="0"/>
-        <w:rPr>
-          <w:rFonts w:ascii="Times New Roman" w:hAnsi="Times New Roman" w:eastAsia="新宋体" w:cs="Times New Roman" w:hint="eastAsia"/>
-          <w:sz w:val="24"/>
-          <w:szCs w:val="24"/>
-        </w:rPr>
+        <w:rPr/>
       </w:pPr>
       <w:r>
         <w:rPr>
@@ -27419,11 +27187,7 @@
         <w:pStyle w:val="Normal"/>
         <w:spacing w:lineRule="auto" w:line="360"/>
         <w:ind w:hangingChars="130" w:startChars="0" w:start="0" w:endChars="0" w:end="0"/>
-        <w:rPr>
-          <w:rFonts w:ascii="Times New Roman" w:hAnsi="Times New Roman" w:eastAsia="新宋体" w:cs="Times New Roman" w:hint="eastAsia"/>
-          <w:sz w:val="24"/>
-          <w:szCs w:val="24"/>
-        </w:rPr>
+        <w:rPr/>
       </w:pPr>
       <w:r>
         <w:rPr>
@@ -27502,12 +27266,7 @@
         <w:pStyle w:val="Normal"/>
         <w:spacing w:lineRule="auto" w:line="360"/>
         <w:ind w:hangingChars="130" w:startChars="0" w:start="0" w:endChars="0" w:end="0"/>
-        <w:rPr>
-          <w:rFonts w:ascii="Times New Roman" w:hAnsi="Times New Roman" w:eastAsia="新宋体" w:cs="Times New Roman" w:hint="eastAsia"/>
-          <w:b/>
-          <w:sz w:val="24"/>
-          <w:szCs w:val="24"/>
-        </w:rPr>
+        <w:rPr/>
       </w:pPr>
       <w:r>
         <w:rPr>
@@ -28039,11 +27798,7 @@
         <w:pStyle w:val="Normal"/>
         <w:spacing w:lineRule="auto" w:line="360"/>
         <w:ind w:hangingChars="130" w:startChars="0" w:start="0" w:endChars="0" w:end="0"/>
-        <w:rPr>
-          <w:rFonts w:ascii="Times New Roman" w:hAnsi="Times New Roman" w:eastAsia="新宋体" w:cs="Times New Roman" w:hint="eastAsia"/>
-          <w:sz w:val="24"/>
-          <w:szCs w:val="24"/>
-        </w:rPr>
+        <w:rPr/>
       </w:pPr>
       <w:r>
         <w:rPr>
@@ -28979,11 +28734,7 @@
         <w:pStyle w:val="Normal"/>
         <w:spacing w:lineRule="auto" w:line="360"/>
         <w:ind w:hangingChars="130" w:startChars="0" w:start="0" w:endChars="0" w:end="0"/>
-        <w:rPr>
-          <w:rFonts w:ascii="Times New Roman" w:hAnsi="Times New Roman" w:eastAsia="新宋体" w:cs="Times New Roman" w:hint="eastAsia"/>
-          <w:sz w:val="24"/>
-          <w:szCs w:val="24"/>
-        </w:rPr>
+        <w:rPr/>
       </w:pPr>
       <w:r>
         <w:rPr>
@@ -29122,11 +28873,7 @@
         <w:pStyle w:val="Normal"/>
         <w:spacing w:lineRule="auto" w:line="360"/>
         <w:ind w:hangingChars="130" w:startChars="0" w:start="0" w:endChars="0" w:end="0"/>
-        <w:rPr>
-          <w:rFonts w:ascii="Times New Roman" w:hAnsi="Times New Roman" w:eastAsia="新宋体" w:cs="Times New Roman" w:hint="eastAsia"/>
-          <w:sz w:val="24"/>
-          <w:szCs w:val="24"/>
-        </w:rPr>
+        <w:rPr/>
       </w:pPr>
       <w:r>
         <w:rPr>
@@ -29274,11 +29021,7 @@
         <w:pStyle w:val="Normal"/>
         <w:spacing w:lineRule="auto" w:line="360"/>
         <w:ind w:hangingChars="130" w:startChars="0" w:start="0" w:endChars="0" w:end="0"/>
-        <w:rPr>
-          <w:rFonts w:ascii="Times New Roman" w:hAnsi="Times New Roman" w:eastAsia="新宋体" w:cs="Times New Roman" w:hint="eastAsia"/>
-          <w:sz w:val="24"/>
-          <w:szCs w:val="24"/>
-        </w:rPr>
+        <w:rPr/>
       </w:pPr>
       <w:r>
         <w:rPr>
@@ -29657,11 +29400,7 @@
         <w:pStyle w:val="Normal"/>
         <w:spacing w:lineRule="auto" w:line="360"/>
         <w:ind w:hangingChars="130" w:startChars="0" w:start="0" w:endChars="0" w:end="0"/>
-        <w:rPr>
-          <w:rFonts w:ascii="Times New Roman" w:hAnsi="Times New Roman" w:eastAsia="新宋体" w:cs="Times New Roman" w:hint="eastAsia"/>
-          <w:sz w:val="24"/>
-          <w:szCs w:val="24"/>
-        </w:rPr>
+        <w:rPr/>
       </w:pPr>
       <w:r>
         <w:rPr>
@@ -30522,11 +30261,7 @@
         <w:pStyle w:val="Normal"/>
         <w:spacing w:lineRule="auto" w:line="360"/>
         <w:ind w:hangingChars="130" w:startChars="0" w:start="0" w:endChars="0" w:end="0"/>
-        <w:rPr>
-          <w:rFonts w:ascii="Times New Roman" w:hAnsi="Times New Roman" w:eastAsia="新宋体" w:cs="Times New Roman" w:hint="eastAsia"/>
-          <w:sz w:val="24"/>
-          <w:szCs w:val="24"/>
-        </w:rPr>
+        <w:rPr/>
       </w:pPr>
       <w:r>
         <w:rPr>
@@ -31839,11 +31574,7 @@
         <w:pStyle w:val="Normal"/>
         <w:spacing w:lineRule="auto" w:line="360"/>
         <w:ind w:hangingChars="130" w:startChars="0" w:start="0" w:endChars="0" w:end="0"/>
-        <w:rPr>
-          <w:rFonts w:ascii="Times New Roman" w:hAnsi="Times New Roman" w:eastAsia="新宋体" w:cs="Times New Roman" w:hint="eastAsia"/>
-          <w:sz w:val="24"/>
-          <w:szCs w:val="24"/>
-        </w:rPr>
+        <w:rPr/>
       </w:pPr>
       <w:r>
         <w:rPr>
@@ -31922,11 +31653,7 @@
         <w:pStyle w:val="Normal"/>
         <w:spacing w:lineRule="auto" w:line="360"/>
         <w:ind w:hangingChars="130" w:startChars="0" w:start="0" w:endChars="0" w:end="0"/>
-        <w:rPr>
-          <w:rFonts w:ascii="Times New Roman" w:hAnsi="Times New Roman" w:eastAsia="新宋体" w:cs="Times New Roman" w:hint="eastAsia"/>
-          <w:sz w:val="24"/>
-          <w:szCs w:val="24"/>
-        </w:rPr>
+        <w:rPr/>
       </w:pPr>
       <w:r>
         <w:rPr>
@@ -32026,11 +31753,7 @@
               <w:spacing w:lineRule="auto" w:line="360"/>
               <w:ind w:hangingChars="130" w:startChars="0" w:start="0" w:endChars="0" w:end="0"/>
               <w:jc w:val="center"/>
-              <w:rPr>
-                <w:rFonts w:ascii="Times New Roman" w:hAnsi="Times New Roman" w:eastAsia="新宋体" w:cs="Times New Roman" w:hint="eastAsia"/>
-                <w:sz w:val="24"/>
-                <w:szCs w:val="24"/>
-              </w:rPr>
+              <w:rPr/>
             </w:pPr>
             <w:r>
               <w:rPr>
@@ -32058,11 +31781,7 @@
               <w:spacing w:lineRule="auto" w:line="360"/>
               <w:ind w:hangingChars="130" w:startChars="0" w:start="0" w:endChars="0" w:end="0"/>
               <w:jc w:val="center"/>
-              <w:rPr>
-                <w:rFonts w:ascii="Times New Roman" w:hAnsi="Times New Roman" w:eastAsia="新宋体" w:cs="Times New Roman" w:hint="eastAsia"/>
-                <w:sz w:val="24"/>
-                <w:szCs w:val="24"/>
-              </w:rPr>
+              <w:rPr/>
             </w:pPr>
             <w:r>
               <w:rPr>
@@ -32090,11 +31809,7 @@
               <w:spacing w:lineRule="auto" w:line="360"/>
               <w:ind w:hangingChars="130" w:startChars="0" w:start="0" w:endChars="0" w:end="0"/>
               <w:jc w:val="center"/>
-              <w:rPr>
-                <w:rFonts w:ascii="Times New Roman" w:hAnsi="Times New Roman" w:eastAsia="新宋体" w:cs="Times New Roman" w:hint="eastAsia"/>
-                <w:sz w:val="24"/>
-                <w:szCs w:val="24"/>
-              </w:rPr>
+              <w:rPr/>
             </w:pPr>
             <w:r>
               <w:rPr>
@@ -32122,11 +31837,7 @@
               <w:spacing w:lineRule="auto" w:line="360"/>
               <w:ind w:hangingChars="130" w:startChars="0" w:start="0" w:endChars="0" w:end="0"/>
               <w:jc w:val="center"/>
-              <w:rPr>
-                <w:rFonts w:ascii="Times New Roman" w:hAnsi="Times New Roman" w:eastAsia="新宋体" w:cs="Times New Roman" w:hint="eastAsia"/>
-                <w:sz w:val="24"/>
-                <w:szCs w:val="24"/>
-              </w:rPr>
+              <w:rPr/>
             </w:pPr>
             <w:r>
               <w:rPr>
@@ -32154,11 +31865,7 @@
               <w:spacing w:lineRule="auto" w:line="360"/>
               <w:ind w:hangingChars="130" w:startChars="0" w:start="0" w:endChars="0" w:end="0"/>
               <w:jc w:val="center"/>
-              <w:rPr>
-                <w:rFonts w:ascii="Times New Roman" w:hAnsi="Times New Roman" w:eastAsia="新宋体" w:cs="Times New Roman" w:hint="eastAsia"/>
-                <w:sz w:val="24"/>
-                <w:szCs w:val="24"/>
-              </w:rPr>
+              <w:rPr/>
             </w:pPr>
             <w:r>
               <w:rPr>
@@ -32186,11 +31893,7 @@
               <w:spacing w:lineRule="auto" w:line="360"/>
               <w:ind w:hangingChars="130" w:startChars="0" w:start="0" w:endChars="0" w:end="0"/>
               <w:jc w:val="center"/>
-              <w:rPr>
-                <w:rFonts w:ascii="Times New Roman" w:hAnsi="Times New Roman" w:eastAsia="新宋体" w:cs="Times New Roman" w:hint="eastAsia"/>
-                <w:sz w:val="24"/>
-                <w:szCs w:val="24"/>
-              </w:rPr>
+              <w:rPr/>
             </w:pPr>
             <w:r>
               <w:rPr>
@@ -32218,11 +31921,7 @@
               <w:spacing w:lineRule="auto" w:line="360"/>
               <w:ind w:hangingChars="130" w:startChars="0" w:start="0" w:endChars="0" w:end="0"/>
               <w:jc w:val="center"/>
-              <w:rPr>
-                <w:rFonts w:ascii="Times New Roman" w:hAnsi="Times New Roman" w:eastAsia="新宋体" w:cs="Times New Roman" w:hint="eastAsia"/>
-                <w:sz w:val="24"/>
-                <w:szCs w:val="24"/>
-              </w:rPr>
+              <w:rPr/>
             </w:pPr>
             <w:r>
               <w:rPr>
@@ -32253,11 +31952,7 @@
               <w:spacing w:lineRule="auto" w:line="360"/>
               <w:ind w:hangingChars="130" w:startChars="0" w:start="0" w:endChars="0" w:end="0"/>
               <w:jc w:val="center"/>
-              <w:rPr>
-                <w:rFonts w:ascii="Times New Roman" w:hAnsi="Times New Roman" w:eastAsia="新宋体" w:cs="Times New Roman" w:hint="eastAsia"/>
-                <w:sz w:val="24"/>
-                <w:szCs w:val="24"/>
-              </w:rPr>
+              <w:rPr/>
             </w:pPr>
             <w:r>
               <w:rPr>
@@ -32285,11 +31980,7 @@
               <w:spacing w:lineRule="auto" w:line="360"/>
               <w:ind w:hangingChars="130" w:startChars="0" w:start="0" w:endChars="0" w:end="0"/>
               <w:jc w:val="center"/>
-              <w:rPr>
-                <w:rFonts w:ascii="Times New Roman" w:hAnsi="Times New Roman" w:eastAsia="新宋体" w:cs="Times New Roman" w:hint="eastAsia"/>
-                <w:sz w:val="24"/>
-                <w:szCs w:val="24"/>
-              </w:rPr>
+              <w:rPr/>
             </w:pPr>
             <w:r>
               <w:rPr>
@@ -32317,11 +32008,7 @@
               <w:spacing w:lineRule="auto" w:line="360"/>
               <w:ind w:hangingChars="130" w:startChars="0" w:start="0" w:endChars="0" w:end="0"/>
               <w:jc w:val="center"/>
-              <w:rPr>
-                <w:rFonts w:ascii="Times New Roman" w:hAnsi="Times New Roman" w:eastAsia="新宋体" w:cs="Times New Roman" w:hint="eastAsia"/>
-                <w:sz w:val="24"/>
-                <w:szCs w:val="24"/>
-              </w:rPr>
+              <w:rPr/>
             </w:pPr>
             <w:r>
               <w:rPr>
@@ -32349,11 +32036,7 @@
               <w:spacing w:lineRule="auto" w:line="360"/>
               <w:ind w:hangingChars="130" w:startChars="0" w:start="0" w:endChars="0" w:end="0"/>
               <w:jc w:val="center"/>
-              <w:rPr>
-                <w:rFonts w:ascii="Times New Roman" w:hAnsi="Times New Roman" w:eastAsia="新宋体" w:cs="Times New Roman" w:hint="eastAsia"/>
-                <w:sz w:val="24"/>
-                <w:szCs w:val="24"/>
-              </w:rPr>
+              <w:rPr/>
             </w:pPr>
             <w:r>
               <w:rPr>
@@ -32381,11 +32064,7 @@
               <w:spacing w:lineRule="auto" w:line="360"/>
               <w:ind w:hangingChars="130" w:startChars="0" w:start="0" w:endChars="0" w:end="0"/>
               <w:jc w:val="center"/>
-              <w:rPr>
-                <w:rFonts w:ascii="Times New Roman" w:hAnsi="Times New Roman" w:eastAsia="新宋体" w:cs="Times New Roman" w:hint="eastAsia"/>
-                <w:sz w:val="24"/>
-                <w:szCs w:val="24"/>
-              </w:rPr>
+              <w:rPr/>
             </w:pPr>
             <w:r>
               <w:rPr>
@@ -32413,11 +32092,7 @@
               <w:spacing w:lineRule="auto" w:line="360"/>
               <w:ind w:hangingChars="130" w:startChars="0" w:start="0" w:endChars="0" w:end="0"/>
               <w:jc w:val="center"/>
-              <w:rPr>
-                <w:rFonts w:ascii="Times New Roman" w:hAnsi="Times New Roman" w:eastAsia="新宋体" w:cs="Times New Roman" w:hint="eastAsia"/>
-                <w:sz w:val="24"/>
-                <w:szCs w:val="24"/>
-              </w:rPr>
+              <w:rPr/>
             </w:pPr>
             <w:r>
               <w:rPr>
@@ -32445,11 +32120,7 @@
               <w:spacing w:lineRule="auto" w:line="360"/>
               <w:ind w:hangingChars="130" w:startChars="0" w:start="0" w:endChars="0" w:end="0"/>
               <w:jc w:val="center"/>
-              <w:rPr>
-                <w:rFonts w:ascii="Times New Roman" w:hAnsi="Times New Roman" w:eastAsia="新宋体" w:cs="Times New Roman" w:hint="eastAsia"/>
-                <w:sz w:val="24"/>
-                <w:szCs w:val="24"/>
-              </w:rPr>
+              <w:rPr/>
             </w:pPr>
             <w:r>
               <w:rPr>
@@ -32477,11 +32148,7 @@
               <w:spacing w:lineRule="auto" w:line="360"/>
               <w:ind w:hangingChars="130" w:startChars="0" w:start="0" w:endChars="0" w:end="0"/>
               <w:jc w:val="center"/>
-              <w:rPr>
-                <w:rFonts w:ascii="Times New Roman" w:hAnsi="Times New Roman" w:eastAsia="新宋体" w:cs="Times New Roman" w:hint="eastAsia"/>
-                <w:sz w:val="24"/>
-                <w:szCs w:val="24"/>
-              </w:rPr>
+              <w:rPr/>
             </w:pPr>
             <w:r>
               <w:rPr>
@@ -32500,11 +32167,7 @@
         <w:pStyle w:val="Normal"/>
         <w:spacing w:lineRule="auto" w:line="360"/>
         <w:ind w:hangingChars="130" w:startChars="0" w:start="0" w:endChars="0" w:end="0"/>
-        <w:rPr>
-          <w:rFonts w:ascii="Times New Roman" w:hAnsi="Times New Roman" w:eastAsia="新宋体" w:cs="Times New Roman" w:hint="eastAsia"/>
-          <w:sz w:val="24"/>
-          <w:szCs w:val="24"/>
-        </w:rPr>
+        <w:rPr/>
       </w:pPr>
       <w:r>
         <w:rPr>
@@ -32843,11 +32506,7 @@
         <w:pStyle w:val="Normal"/>
         <w:spacing w:lineRule="auto" w:line="360"/>
         <w:ind w:hangingChars="130" w:startChars="0" w:start="0" w:endChars="0" w:end="0"/>
-        <w:rPr>
-          <w:rFonts w:ascii="Times New Roman" w:hAnsi="Times New Roman" w:eastAsia="新宋体" w:cs="Times New Roman" w:hint="eastAsia"/>
-          <w:sz w:val="24"/>
-          <w:szCs w:val="24"/>
-        </w:rPr>
+        <w:rPr/>
       </w:pPr>
       <w:r>
         <w:rPr>
@@ -33267,11 +32926,7 @@
         <w:pStyle w:val="Normal"/>
         <w:spacing w:lineRule="auto" w:line="360"/>
         <w:ind w:hangingChars="130" w:startChars="0" w:start="0" w:endChars="0" w:end="0"/>
-        <w:rPr>
-          <w:rFonts w:ascii="Times New Roman" w:hAnsi="Times New Roman" w:eastAsia="新宋体" w:cs="Times New Roman" w:hint="eastAsia"/>
-          <w:sz w:val="24"/>
-          <w:szCs w:val="24"/>
-        </w:rPr>
+        <w:rPr/>
       </w:pPr>
       <w:r>
         <w:rPr>
@@ -33645,11 +33300,7 @@
         <w:pStyle w:val="Normal"/>
         <w:spacing w:lineRule="auto" w:line="360"/>
         <w:ind w:hangingChars="130" w:startChars="0" w:start="0" w:endChars="0" w:end="0"/>
-        <w:rPr>
-          <w:rFonts w:ascii="Times New Roman" w:hAnsi="Times New Roman" w:eastAsia="新宋体" w:cs="Times New Roman" w:hint="eastAsia"/>
-          <w:sz w:val="24"/>
-          <w:szCs w:val="24"/>
-        </w:rPr>
+        <w:rPr/>
       </w:pPr>
       <w:r>
         <w:rPr>
@@ -33681,11 +33332,7 @@
         <w:pStyle w:val="Normal"/>
         <w:spacing w:lineRule="auto" w:line="360"/>
         <w:ind w:hangingChars="130" w:startChars="0" w:start="0" w:endChars="0" w:end="0"/>
-        <w:rPr>
-          <w:rFonts w:ascii="Times New Roman" w:hAnsi="Times New Roman" w:eastAsia="新宋体" w:cs="Times New Roman" w:hint="eastAsia"/>
-          <w:sz w:val="24"/>
-          <w:szCs w:val="24"/>
-        </w:rPr>
+        <w:rPr/>
       </w:pPr>
       <w:r>
         <w:rPr>
@@ -34134,11 +33781,7 @@
         <w:pStyle w:val="Normal"/>
         <w:spacing w:lineRule="auto" w:line="360"/>
         <w:ind w:hangingChars="130" w:startChars="0" w:start="0" w:endChars="0" w:end="0"/>
-        <w:rPr>
-          <w:rFonts w:ascii="Times New Roman" w:hAnsi="Times New Roman" w:eastAsia="新宋体" w:cs="Times New Roman" w:hint="eastAsia"/>
-          <w:sz w:val="24"/>
-          <w:szCs w:val="24"/>
-        </w:rPr>
+        <w:rPr/>
       </w:pPr>
       <w:r>
         <w:rPr>
@@ -35040,11 +34683,7 @@
         <w:pStyle w:val="Normal"/>
         <w:spacing w:lineRule="auto" w:line="360"/>
         <w:ind w:hangingChars="130" w:startChars="0" w:start="0" w:endChars="0" w:end="0"/>
-        <w:rPr>
-          <w:rFonts w:ascii="Times New Roman" w:hAnsi="Times New Roman" w:eastAsia="新宋体" w:cs="Times New Roman" w:hint="eastAsia"/>
-          <w:sz w:val="24"/>
-          <w:szCs w:val="24"/>
-        </w:rPr>
+        <w:rPr/>
       </w:pPr>
       <w:r>
         <w:rPr>
@@ -35909,11 +35548,7 @@
         <w:pStyle w:val="Normal"/>
         <w:spacing w:lineRule="auto" w:line="360"/>
         <w:ind w:hangingChars="130" w:startChars="0" w:start="0" w:endChars="0" w:end="0"/>
-        <w:rPr>
-          <w:rFonts w:ascii="Times New Roman" w:hAnsi="Times New Roman" w:eastAsia="新宋体" w:cs="Times New Roman" w:hint="eastAsia"/>
-          <w:sz w:val="24"/>
-          <w:szCs w:val="24"/>
-        </w:rPr>
+        <w:rPr/>
       </w:pPr>
       <w:r>
         <w:rPr>
@@ -36491,11 +36126,7 @@
         <w:pStyle w:val="Normal"/>
         <w:spacing w:lineRule="auto" w:line="360"/>
         <w:ind w:hangingChars="130" w:startChars="0" w:start="0" w:endChars="0" w:end="0"/>
-        <w:rPr>
-          <w:rFonts w:ascii="Times New Roman" w:hAnsi="Times New Roman" w:eastAsia="新宋体" w:cs="Times New Roman" w:hint="eastAsia"/>
-          <w:sz w:val="24"/>
-          <w:szCs w:val="24"/>
-        </w:rPr>
+        <w:rPr/>
       </w:pPr>
       <w:r>
         <w:rPr>
@@ -38013,11 +37644,7 @@
         <w:pStyle w:val="Normal"/>
         <w:spacing w:lineRule="auto" w:line="360"/>
         <w:ind w:hangingChars="130" w:startChars="0" w:start="0" w:endChars="0" w:end="0"/>
-        <w:rPr>
-          <w:rFonts w:ascii="Times New Roman" w:hAnsi="Times New Roman" w:eastAsia="新宋体" w:cs="Times New Roman" w:hint="eastAsia"/>
-          <w:sz w:val="24"/>
-          <w:szCs w:val="24"/>
-        </w:rPr>
+        <w:rPr/>
       </w:pPr>
       <w:r>
         <w:rPr>
@@ -40167,11 +39794,7 @@
         <w:pStyle w:val="Normal"/>
         <w:spacing w:lineRule="auto" w:line="360"/>
         <w:ind w:hangingChars="130" w:startChars="0" w:start="0" w:endChars="0" w:end="0"/>
-        <w:rPr>
-          <w:rFonts w:ascii="Times New Roman" w:hAnsi="Times New Roman" w:eastAsia="新宋体" w:cs="Times New Roman" w:hint="eastAsia"/>
-          <w:sz w:val="24"/>
-          <w:szCs w:val="24"/>
-        </w:rPr>
+        <w:rPr/>
       </w:pPr>
       <w:r>
         <w:rPr>
@@ -40211,11 +39834,7 @@
         <w:pStyle w:val="Normal"/>
         <w:spacing w:lineRule="auto" w:line="360"/>
         <w:ind w:hangingChars="130" w:startChars="0" w:start="0" w:endChars="0" w:end="0"/>
-        <w:rPr>
-          <w:rFonts w:ascii="Times New Roman" w:hAnsi="Times New Roman" w:eastAsia="新宋体" w:cs="Times New Roman" w:hint="eastAsia"/>
-          <w:sz w:val="24"/>
-          <w:szCs w:val="24"/>
-        </w:rPr>
+        <w:rPr/>
       </w:pPr>
       <w:r>
         <w:rPr>
@@ -40345,11 +39964,7 @@
         <w:pStyle w:val="Normal"/>
         <w:spacing w:lineRule="auto" w:line="360"/>
         <w:ind w:hangingChars="130" w:startChars="0" w:start="0" w:endChars="0" w:end="0"/>
-        <w:rPr>
-          <w:rFonts w:ascii="Times New Roman" w:hAnsi="Times New Roman" w:eastAsia="新宋体" w:cs="Times New Roman" w:hint="eastAsia"/>
-          <w:sz w:val="24"/>
-          <w:szCs w:val="24"/>
-        </w:rPr>
+        <w:rPr/>
       </w:pPr>
       <w:r>
         <w:rPr>
@@ -40403,11 +40018,7 @@
         <w:pStyle w:val="Normal"/>
         <w:spacing w:lineRule="auto" w:line="360"/>
         <w:ind w:hangingChars="130" w:startChars="0" w:start="0" w:endChars="0" w:end="0"/>
-        <w:rPr>
-          <w:rFonts w:ascii="Times New Roman" w:hAnsi="Times New Roman" w:eastAsia="新宋体" w:cs="Times New Roman" w:hint="eastAsia"/>
-          <w:sz w:val="24"/>
-          <w:szCs w:val="24"/>
-        </w:rPr>
+        <w:rPr/>
       </w:pPr>
       <w:r>
         <w:rPr>
@@ -40906,11 +40517,7 @@
         <w:pStyle w:val="Normal"/>
         <w:spacing w:lineRule="auto" w:line="360"/>
         <w:ind w:hangingChars="130" w:startChars="0" w:start="0" w:endChars="0" w:end="0"/>
-        <w:rPr>
-          <w:rFonts w:ascii="Times New Roman" w:hAnsi="Times New Roman" w:eastAsia="新宋体" w:cs="Times New Roman" w:hint="eastAsia"/>
-          <w:sz w:val="24"/>
-          <w:szCs w:val="24"/>
-        </w:rPr>
+        <w:rPr/>
       </w:pPr>
       <w:r>
         <w:rPr>
@@ -45015,7 +44622,9 @@
         <w:pStyle w:val="Normal"/>
         <w:spacing w:lineRule="auto" w:line="360"/>
         <w:ind w:hangingChars="130" w:startChars="0" w:start="0" w:endChars="0" w:end="0"/>
-        <w:rPr/>
+        <w:rPr>
+          <w:rFonts w:eastAsia="新宋体" w:hint="eastAsia"/>
+        </w:rPr>
       </w:pPr>
       <w:r>
         <w:rPr>
@@ -45104,7 +44713,7 @@
         <w:sz w:val="24"/>
         <w:szCs w:val="24"/>
       </w:rPr>
-      <w:t>23</w:t>
+      <w:t>39</w:t>
     </w:r>
     <w:r>
       <w:rPr>
@@ -45156,7 +44765,7 @@
         <w:sz w:val="24"/>
         <w:szCs w:val="24"/>
       </w:rPr>
-      <w:t>23</w:t>
+      <w:t>39</w:t>
     </w:r>
     <w:r>
       <w:rPr>
@@ -45211,7 +44820,7 @@
   <w:docDefaults>
     <w:rPrDefault>
       <w:rPr>
-        <w:rFonts w:ascii="Liberation Serif" w:hAnsi="Liberation Serif" w:eastAsia="Linux Libertine G" w:cs="Noto Sans"/>
+        <w:rFonts w:ascii="Liberation Serif" w:hAnsi="Liberation Serif" w:eastAsia="华文宋体" w:cs="Arial Unicode MS"/>
         <w:sz w:val="24"/>
         <w:szCs w:val="24"/>
         <w:lang w:val="en-US" w:eastAsia="zh-CN" w:bidi="hi-IN"/>
@@ -45307,7 +44916,7 @@
       <w:spacing w:before="240" w:after="120"/>
     </w:pPr>
     <w:rPr>
-      <w:rFonts w:ascii="Liberation Sans" w:hAnsi="Liberation Sans" w:eastAsia="Linux Libertine G" w:cs="Noto Sans"/>
+      <w:rFonts w:ascii="Liberation Sans" w:hAnsi="Liberation Sans" w:eastAsia="Arial Unicode MS" w:cs="Arial Unicode MS"/>
       <w:sz w:val="28"/>
       <w:szCs w:val="28"/>
     </w:rPr>
@@ -45325,7 +44934,7 @@
     <w:basedOn w:val="BodyText"/>
     <w:pPr/>
     <w:rPr>
-      <w:rFonts w:cs="Noto Sans"/>
+      <w:rFonts w:cs="Arial Unicode MS"/>
     </w:rPr>
   </w:style>
   <w:style w:type="paragraph" w:styleId="Caption">
@@ -45337,7 +44946,7 @@
       <w:spacing w:before="120" w:after="120"/>
     </w:pPr>
     <w:rPr>
-      <w:rFonts w:cs="Noto Sans"/>
+      <w:rFonts w:cs="Arial Unicode MS"/>
       <w:i/>
       <w:iCs/>
       <w:sz w:val="24"/>
@@ -45352,7 +44961,7 @@
       <w:suppressLineNumbers/>
     </w:pPr>
     <w:rPr>
-      <w:rFonts w:cs="Noto Sans"/>
+      <w:rFonts w:cs="Arial Unicode MS"/>
     </w:rPr>
   </w:style>
   <w:style w:type="paragraph" w:styleId="HeaderandFooter">

</xml_diff>